<commit_message>
fix: add Drugs & Cosmetics Act / NBTC alongside AABB standards (COP8)
AABB (US) was the only cited standard for blood transfusion practice.
Added the binding Indian framework - Drugs and Cosmetics Act 1940/
Rules 1945 (Schedule F, Part XII) and NBTC guidelines - alongside it,
and added both to the Verified Sources footer.

Co-Authored-By: Claude Sonnet 5 <noreply@anthropic.com>
Claude-Session: https://claude.ai/code/session_01TPRLtLhmTCP5z94Q3FiE5v
</commit_message>
<xml_diff>
--- a/policies/build/chapters_v2/COP/document/COP8/SOP_Blood_Transfusion_Administration.docx
+++ b/policies/build/chapters_v2/COP/document/COP8/SOP_Blood_Transfusion_Administration.docx
@@ -321,26 +321,17 @@
     </w:p>
     <w:p>
       <w:r>
-        <w:t xml:space="preserve">Treating Doctor: </w:t>
-      </w:r>
-      <w:r>
-        <w:t>orders the transfusion with a clear, evidence-based indication.</w:t>
+        <w:t xml:space="preserve">Treating Doctor: orders the transfusion with a clear, evidence-based indication.</w:t>
       </w:r>
     </w:p>
     <w:p>
       <w:r>
-        <w:t xml:space="preserve">Nursing Staff: </w:t>
-      </w:r>
-      <w:r>
-        <w:t>performs identity verification, administers, and monitors the transfusion.</w:t>
+        <w:t xml:space="preserve">Nursing Staff: performs identity verification, administers, and monitors the transfusion.</w:t>
       </w:r>
     </w:p>
     <w:p>
       <w:r>
-        <w:t xml:space="preserve">Blood Bank Staff: </w:t>
-      </w:r>
-      <w:r>
-        <w:t>completes pre-transfusion testing and releases only cleared units.</w:t>
+        <w:t xml:space="preserve">Blood Bank Staff: completes pre-transfusion testing and releases only cleared units.</w:t>
       </w:r>
     </w:p>
     <w:p>
@@ -439,6 +430,14 @@
           <w:t>AABB. (2023). Standards for blood banks and transfusion services (35th ed.).</w:t>
         </w:r>
       </w:hyperlink>
+    </w:p>
+    <w:p>
+      <w:pPr>
+        <w:pStyle w:val="ListParagraph"/>
+      </w:pPr>
+      <w:r>
+        <w:t>Note: AABB standards (US) are cited for technique only. In India, blood transfusion practice is governed by the Drugs and Cosmetics Act, 1940 and Rules, 1945 (Schedule F, Part XII — blood bank licensing), and by the National Blood Transfusion Council (NBTC) guidelines, which apply alongside AABB as the binding Indian framework.</w:t>
+      </w:r>
     </w:p>
     <w:p>
       <w:pPr>
@@ -706,6 +705,22 @@
           <w:t>AABB — Fundamental Standards for Blood Collection and Transfusion (2nd edition)</w:t>
         </w:r>
       </w:hyperlink>
+    </w:p>
+    <w:p>
+      <w:pPr>
+        <w:pStyle w:val="ListParagraph"/>
+      </w:pPr>
+      <w:r>
+        <w:t>Drugs and Cosmetics Act, 1940 and Rules, 1945 — Schedule F, Part XII (blood bank licensing and operation) — named source, binding Indian regulation; check directly.</w:t>
+      </w:r>
+    </w:p>
+    <w:p>
+      <w:pPr>
+        <w:pStyle w:val="ListParagraph"/>
+      </w:pPr>
+      <w:r>
+        <w:t>National Blood Transfusion Council (NBTC) — Guidelines for Blood Transfusion Services in India — named source, no working link could be verified from here; check directly.</w:t>
+      </w:r>
     </w:p>
     <w:p>
       <w:pPr>

</xml_diff>